<commit_message>
WF-14: rename a change-log heading that read as a touch section
Co-Authored-By: Claude Opus 5 <noreply@anthropic.com>
</commit_message>
<xml_diff>
--- a/campaigns/WF-14-recovery-protocol.docx
+++ b/campaigns/WF-14-recovery-protocol.docx
@@ -1487,13 +1487,13 @@
         </w:tc>
       </w:tr>
     </w:tbl>
-    <w:bookmarkStart w:id="18" w:name="X790612e13f96605ca98ce229848121affa5359b"/>
+    <w:bookmarkStart w:id="18" w:name="X2f76fc67e7d89ce056b5343a14601eb7c7ebf67"/>
     <w:p>
       <w:pPr>
         <w:pStyle w:val="Heading2"/>
       </w:pPr>
       <w:r>
-        <w:t xml:space="preserve">Touch 4B carried the flagged phrase verbatim</w:t>
+        <w:t xml:space="preserve">The flagged phrase survived verbatim in 4B</w:t>
       </w:r>
     </w:p>
     <w:p>

</xml_diff>